<commit_message>
Fire Ecology submission package (built from 0133515)
</commit_message>
<xml_diff>
--- a/paper/submission_fire_ecology/cover_letter_draft.docx
+++ b/paper/submission_fire_ecology/cover_letter_draft.docx
@@ -86,7 +86,7 @@
         <w:t xml:space="preserve"> </w:t>
       </w:r>
       <w:r>
-        <w:t xml:space="preserve">main text has 7,862 words, with figures, tables and references excluded.</w:t>
+        <w:t xml:space="preserve">main text has 8,549 words, with figures, tables and references excluded.</w:t>
       </w:r>
     </w:p>
     <w:p>
@@ -94,16 +94,6 @@
         <w:pStyle w:val="BodyText"/>
       </w:pPr>
       <w:r>
-        <w:rPr>
-          <w:b/>
-          <w:bCs/>
-        </w:rPr>
-        <w:t xml:space="preserve">Fit to the scope.</w:t>
-      </w:r>
-      <w:r>
-        <w:t xml:space="preserve"> </w:t>
-      </w:r>
-      <w:r>
         <w:t xml:space="preserve">The manuscript belongs to two of the journal’s listed topics, wildfire planning</w:t>
       </w:r>
       <w:r>
@@ -154,16 +144,6 @@
         <w:pStyle w:val="BodyText"/>
       </w:pPr>
       <w:r>
-        <w:rPr>
-          <w:b/>
-          <w:bCs/>
-        </w:rPr>
-        <w:t xml:space="preserve">Novelty and relevance to management.</w:t>
-      </w:r>
-      <w:r>
-        <w:t xml:space="preserve"> </w:t>
-      </w:r>
-      <w:r>
         <w:t xml:space="preserve">Pre-fire satellite land surface temperature and dryness</w:t>
       </w:r>
       <w:r>
@@ -188,13 +168,13 @@
         <w:t xml:space="preserve"> </w:t>
       </w:r>
       <w:r>
-        <w:t xml:space="preserve">five regions, which is consistent with land surface temperature describing vegetation and terrain</w:t>
-      </w:r>
-      <w:r>
-        <w:t xml:space="preserve"> </w:t>
-      </w:r>
-      <w:r>
-        <w:t xml:space="preserve">rather than fuel dryness. The study also shows that the area on which a model is scored changes its</w:t>
+        <w:t xml:space="preserve">five regions, which is consistent with land surface temperature tracking canopy cover and terrain</w:t>
+      </w:r>
+      <w:r>
+        <w:t xml:space="preserve"> </w:t>
+      </w:r>
+      <w:r>
+        <w:t xml:space="preserve">more closely than fuel dryness. The study also shows that the area on which a model is scored changes its</w:t>
       </w:r>
       <w:r>
         <w:t xml:space="preserve"> </w:t>
@@ -206,19 +186,19 @@
         <w:t xml:space="preserve"> </w:t>
       </w:r>
       <w:r>
-        <w:t xml:space="preserve">region-wide. For fire managers the message is direct. A borrowed susceptibility model should be tested</w:t>
-      </w:r>
-      <w:r>
-        <w:t xml:space="preserve"> </w:t>
-      </w:r>
-      <w:r>
-        <w:t xml:space="preserve">against burned areas in the target region before it guides prevention planning, and every reported</w:t>
-      </w:r>
-      <w:r>
-        <w:t xml:space="preserve"> </w:t>
-      </w:r>
-      <w:r>
-        <w:t xml:space="preserve">score should name the area it refers to. Each region contributes one fire season, and the manuscript</w:t>
+        <w:t xml:space="preserve">region-wide. For fire managers, this means that a borrowed susceptibility model should be tested</w:t>
+      </w:r>
+      <w:r>
+        <w:t xml:space="preserve"> </w:t>
+      </w:r>
+      <w:r>
+        <w:t xml:space="preserve">against burned areas in the target region before it guides prevention planning, and that every</w:t>
+      </w:r>
+      <w:r>
+        <w:t xml:space="preserve"> </w:t>
+      </w:r>
+      <w:r>
+        <w:t xml:space="preserve">reported score should name the area it refers to. Each region contributes one fire season, and the manuscript</w:t>
       </w:r>
       <w:r>
         <w:t xml:space="preserve"> </w:t>
@@ -231,16 +211,6 @@
       <w:pPr>
         <w:pStyle w:val="BodyText"/>
       </w:pPr>
-      <w:r>
-        <w:rPr>
-          <w:b/>
-          <w:bCs/>
-        </w:rPr>
-        <w:t xml:space="preserve">Declarations.</w:t>
-      </w:r>
-      <w:r>
-        <w:t xml:space="preserve"> </w:t>
-      </w:r>
       <w:r>
         <w:t xml:space="preserve">The authors declare that they have no competing interests. The manuscript is not</w:t>
       </w:r>
@@ -321,11 +291,7 @@
         <w:pStyle w:val="BodyText"/>
       </w:pPr>
       <w:r>
-        <w:rPr>
-          <w:b/>
-          <w:bCs/>
-        </w:rPr>
-        <w:t xml:space="preserve">Suggested reviewers.</w:t>
+        <w:t xml:space="preserve">We suggest the following reviewers:</w:t>
       </w:r>
     </w:p>
     <w:p>

</xml_diff>